<commit_message>
docs: 加入流程圖（README×5 + archive×2）+ README §12 未來規劃
依交接需求為文件補上對應圖表與未來方向（圖用 Mermaid，GitHub 直接渲染）：

- README.md：新增 5 個 Mermaid 圖 —— 系統架構與資料流、每日 pipeline 步驟與失敗防線、
  AI 雙引擎決策流、訊號研究軌跡、未來六大方向；並新增「## 12. 未來規劃與可發展方向」
  （訊號準度／產品閉環／基礎設施／AI內容深化／前台體驗／宏觀面板 六大方向）。
- docs/archive/：部署與運維 加「部署架構圖」、訊號研究記錄 加「研究軌跡圖」；
  一併修正搬入 archive 後失效的 ../README.md 等相對連結。
- scripts/export_readme_docx.py：支援 ```mermaid（Word 不渲染 → 輸出圖說＋「見線上版」
  引導註記，不外洩原始碼）。
- 重新產生 docs/crypto-quant_專案說明.docx（已驗證：mermaid 原始碼不外洩、圖說與 §12 齊全）。

註：不需要某張圖時，刪掉該 ```mermaid 區塊（含上方「▸ 圖：」圖說）即可。

Co-Authored-By: Claude Opus 4.8 (1M context) <noreply@anthropic.com>
</commit_message>
<xml_diff>
--- a/docs/crypto-quant_專案說明.docx
+++ b/docs/crypto-quant_專案說明.docx
@@ -1711,149 +1711,33 @@
       </w:r>
     </w:p>
     <w:p>
+      <w:r>
+        <w:rPr>
+          <w:rFonts w:eastAsia="微軟正黑體"/>
+          <w:b/>
+        </w:rPr>
+        <w:t>▸ 圖：系統架構與資料流</w:t>
+      </w:r>
+      <w:r>
+        <w:rPr>
+          <w:rFonts w:eastAsia="微軟正黑體"/>
+          <w:b w:val="0"/>
+        </w:rPr>
+        <w:t>（線上 README 可見渲染圖）</w:t>
+      </w:r>
+    </w:p>
+    <w:p>
       <w:pPr>
-        <w:spacing w:after="80"/>
         <w:ind w:left="170"/>
       </w:pPr>
       <w:r>
         <w:rPr>
-          <w:rFonts w:ascii="Consolas" w:hAnsi="Consolas" w:eastAsia="微軟正黑體"/>
-          <w:color w:val="333333"/>
-          <w:sz w:val="18"/>
-        </w:rPr>
-        <w:t>Binance API ──每日09:00──▶ src/fetch_binance.py ──▶ data/clean/*_1d.csv ─┐</w:t>
-      </w:r>
-      <w:r>
-        <w:br/>
-      </w:r>
-      <w:r>
-        <w:rPr>
-          <w:rFonts w:ascii="Consolas" w:hAnsi="Consolas" w:eastAsia="微軟正黑體"/>
-          <w:color w:val="333333"/>
-          <w:sz w:val="18"/>
-        </w:rPr>
-        <w:t xml:space="preserve">            ──每小時:06──▶（--interval 1h,增量,只存已收盤K棒）*_1h.csv ─┤</w:t>
-      </w:r>
-      <w:r>
-        <w:br/>
-      </w:r>
-      <w:r>
-        <w:rPr>
-          <w:rFonts w:ascii="Consolas" w:hAnsi="Consolas" w:eastAsia="微軟正黑體"/>
-          <w:color w:val="333333"/>
-          <w:sz w:val="18"/>
-        </w:rPr>
-        <w:t xml:space="preserve">                                                                         ▼</w:t>
-      </w:r>
-      <w:r>
-        <w:br/>
-      </w:r>
-      <w:r>
-        <w:rPr>
-          <w:rFonts w:ascii="Consolas" w:hAnsi="Consolas" w:eastAsia="微軟正黑體"/>
-          <w:color w:val="333333"/>
-          <w:sz w:val="18"/>
-        </w:rPr>
-        <w:t xml:space="preserve">                          src/indicators.py ──▶ reports/indicators_*.csv ─▶ app_db.ingest_market_data()</w:t>
-      </w:r>
-      <w:r>
-        <w:br/>
-      </w:r>
-      <w:r>
-        <w:rPr>
-          <w:rFonts w:ascii="Consolas" w:hAnsi="Consolas" w:eastAsia="微軟正黑體"/>
-          <w:color w:val="333333"/>
-          <w:sz w:val="18"/>
-        </w:rPr>
-        <w:t xml:space="preserve">                                                                         ▼</w:t>
-      </w:r>
-      <w:r>
-        <w:br/>
-      </w:r>
-      <w:r>
-        <w:rPr>
-          <w:rFonts w:ascii="Consolas" w:hAnsi="Consolas" w:eastAsia="微軟正黑體"/>
-          <w:color w:val="333333"/>
-          <w:sz w:val="18"/>
-        </w:rPr>
-        <w:t>RSS×9 + Google News ──每30分──▶ sentiment._fetch_and_save() ──▶ data/news.db（情緒詞庫標註+幣種標記+去重）</w:t>
-      </w:r>
-      <w:r>
-        <w:br/>
-      </w:r>
-      <w:r>
-        <w:rPr>
-          <w:rFonts w:ascii="Consolas" w:hAnsi="Consolas" w:eastAsia="微軟正黑體"/>
-          <w:color w:val="333333"/>
-          <w:sz w:val="18"/>
-        </w:rPr>
-        <w:t>alternative.me（恐懼貪婪）──▶ fear_greed 表                              │</w:t>
-      </w:r>
-      <w:r>
-        <w:br/>
-      </w:r>
-      <w:r>
-        <w:rPr>
-          <w:rFonts w:ascii="Consolas" w:hAnsi="Consolas" w:eastAsia="微軟正黑體"/>
-          <w:color w:val="333333"/>
-          <w:sz w:val="18"/>
-        </w:rPr>
-        <w:t xml:space="preserve">                                                                         ▼</w:t>
-      </w:r>
-      <w:r>
-        <w:br/>
-      </w:r>
-      <w:r>
-        <w:rPr>
-          <w:rFonts w:ascii="Consolas" w:hAnsi="Consolas" w:eastAsia="微軟正黑體"/>
-          <w:color w:val="333333"/>
-          <w:sz w:val="18"/>
-        </w:rPr>
-        <w:t xml:space="preserve">                                    SQLite: data/app.db（單一資料來源）+ data/news.db</w:t>
-      </w:r>
-      <w:r>
-        <w:br/>
-      </w:r>
-      <w:r>
-        <w:rPr>
-          <w:rFonts w:ascii="Consolas" w:hAnsi="Consolas" w:eastAsia="微軟正黑體"/>
-          <w:color w:val="333333"/>
-          <w:sz w:val="18"/>
-        </w:rPr>
-        <w:t xml:space="preserve">                                                                         ▼</w:t>
-      </w:r>
-      <w:r>
-        <w:br/>
-      </w:r>
-      <w:r>
-        <w:rPr>
-          <w:rFonts w:ascii="Consolas" w:hAnsi="Consolas" w:eastAsia="微軟正黑體"/>
-          <w:color w:val="333333"/>
-          <w:sz w:val="18"/>
-        </w:rPr>
-        <w:t xml:space="preserve">                                    FastAPI backend/（/api/*）＋排程 scheduler.py</w:t>
-      </w:r>
-      <w:r>
-        <w:br/>
-      </w:r>
-      <w:r>
-        <w:rPr>
-          <w:rFonts w:ascii="Consolas" w:hAnsi="Consolas" w:eastAsia="微軟正黑體"/>
-          <w:color w:val="333333"/>
-          <w:sz w:val="18"/>
-        </w:rPr>
-        <w:t xml:space="preserve">                                                                         ▼</w:t>
-      </w:r>
-      <w:r>
-        <w:br/>
-      </w:r>
-      <w:r>
-        <w:rPr>
-          <w:rFonts w:ascii="Consolas" w:hAnsi="Consolas" w:eastAsia="微軟正黑體"/>
-          <w:color w:val="333333"/>
-          <w:sz w:val="18"/>
-        </w:rPr>
-        <w:t xml:space="preserve">                                    React frontend/（vite build 後由 FastAPI 服務）</w:t>
+          <w:rFonts w:eastAsia="微軟正黑體"/>
+          <w:i/>
+          <w:color w:val="888888"/>
+          <w:sz w:val="19"/>
+        </w:rPr>
+        <w:t>〔流程圖：請於 GitHub 線上版 README 檢視渲染後的圖表〕</w:t>
       </w:r>
     </w:p>
     <w:p>
@@ -3529,36 +3413,33 @@
     </w:tbl>
     <w:p/>
     <w:p>
-      <w:pPr>
-        <w:ind w:left="340"/>
-      </w:pPr>
-      <w:r>
-        <w:rPr>
-          <w:color w:val="888888"/>
-        </w:rPr>
-        <w:t xml:space="preserve">▍ </w:t>
+      <w:r>
+        <w:rPr>
+          <w:rFonts w:eastAsia="微軟正黑體"/>
+          <w:b/>
+        </w:rPr>
+        <w:t>▸ 圖：每日 pipeline 步驟與失敗防線</w:t>
       </w:r>
       <w:r>
         <w:rPr>
           <w:rFonts w:eastAsia="微軟正黑體"/>
           <w:b w:val="0"/>
         </w:rPr>
-        <w:t xml:space="preserve">每步都經結束碼檢查 + 收尾「資料新鮮度」防線，任一步失敗整個 job 標 </w:t>
-      </w:r>
-      <w:r>
-        <w:rPr>
-          <w:rFonts w:ascii="Consolas" w:hAnsi="Consolas" w:eastAsia="微軟正黑體"/>
-          <w:color w:val="B03A2E"/>
+        <w:t>（線上 README 可見渲染圖）</w:t>
+      </w:r>
+    </w:p>
+    <w:p>
+      <w:pPr>
+        <w:ind w:left="170"/>
+      </w:pPr>
+      <w:r>
+        <w:rPr>
+          <w:rFonts w:eastAsia="微軟正黑體"/>
+          <w:i/>
+          <w:color w:val="888888"/>
           <w:sz w:val="19"/>
         </w:rPr>
-        <w:t>failed</w:t>
-      </w:r>
-      <w:r>
-        <w:rPr>
-          <w:rFonts w:eastAsia="微軟正黑體"/>
-          <w:b w:val="0"/>
-        </w:rPr>
-        <w:t>，不再假性成功。</w:t>
+        <w:t>〔流程圖：請於 GitHub 線上版 README 檢視渲染後的圖表〕</w:t>
       </w:r>
     </w:p>
     <w:p>
@@ -3576,6 +3457,39 @@
           <w:rFonts w:eastAsia="微軟正黑體"/>
           <w:b w:val="0"/>
         </w:rPr>
+        <w:t xml:space="preserve">每步都經結束碼檢查 + 收尾「資料新鮮度」防線，任一步失敗整個 job 標 </w:t>
+      </w:r>
+      <w:r>
+        <w:rPr>
+          <w:rFonts w:ascii="Consolas" w:hAnsi="Consolas" w:eastAsia="微軟正黑體"/>
+          <w:color w:val="B03A2E"/>
+          <w:sz w:val="19"/>
+        </w:rPr>
+        <w:t>failed</w:t>
+      </w:r>
+      <w:r>
+        <w:rPr>
+          <w:rFonts w:eastAsia="微軟正黑體"/>
+          <w:b w:val="0"/>
+        </w:rPr>
+        <w:t>，不再假性成功。</w:t>
+      </w:r>
+    </w:p>
+    <w:p>
+      <w:pPr>
+        <w:ind w:left="340"/>
+      </w:pPr>
+      <w:r>
+        <w:rPr>
+          <w:color w:val="888888"/>
+        </w:rPr>
+        <w:t xml:space="preserve">▍ </w:t>
+      </w:r>
+      <w:r>
+        <w:rPr>
+          <w:rFonts w:eastAsia="微軟正黑體"/>
+          <w:b w:val="0"/>
+        </w:rPr>
         <w:t>（舊版有的「算相關性」步驟已移除：只產 PNG 熱圖無人用，</w:t>
       </w:r>
       <w:r>
@@ -3783,80 +3697,33 @@
       </w:r>
     </w:p>
     <w:p>
-      <w:pPr>
-        <w:pStyle w:val="Heading2"/>
-      </w:pPr>
+      <w:r>
+        <w:rPr>
+          <w:rFonts w:eastAsia="微軟正黑體"/>
+          <w:b/>
+        </w:rPr>
+        <w:t>▸ 圖：AI 雙引擎決策流</w:t>
+      </w:r>
       <w:r>
         <w:rPr>
           <w:rFonts w:eastAsia="微軟正黑體"/>
           <w:b w:val="0"/>
         </w:rPr>
-        <w:t>8. 新聞情緒管線</w:t>
+        <w:t>（線上 README 可見渲染圖）</w:t>
       </w:r>
     </w:p>
     <w:p>
+      <w:pPr>
+        <w:ind w:left="170"/>
+      </w:pPr>
       <w:r>
         <w:rPr>
           <w:rFonts w:eastAsia="微軟正黑體"/>
-          <w:b w:val="0"/>
-        </w:rPr>
-        <w:t>真實來源（只搬運不創作，每則帶原始網址）：CoinTelegraph、CoinDesk、Decrypt、TheBlock、</w:t>
-      </w:r>
-    </w:p>
-    <w:p>
-      <w:r>
-        <w:rPr>
-          <w:rFonts w:eastAsia="微軟正黑體"/>
-          <w:b w:val="0"/>
-        </w:rPr>
-        <w:t>CryptoSlate、Blockworks、BitcoinMagazine、動區、鏈新聞 + Google News 中文聚合（市場級+幣種級）。</w:t>
-      </w:r>
-    </w:p>
-    <w:p>
-      <w:r>
-        <w:rPr>
-          <w:rFonts w:eastAsia="微軟正黑體"/>
-          <w:b w:val="0"/>
-        </w:rPr>
-        <w:t>標題經</w:t>
-      </w:r>
-      <w:r>
-        <w:rPr>
-          <w:rFonts w:eastAsia="微軟正黑體"/>
-          <w:b/>
-        </w:rPr>
-        <w:t>中英雙語加權詞庫</w:t>
-      </w:r>
-      <w:r>
-        <w:rPr>
-          <w:rFonts w:eastAsia="微軟正黑體"/>
-          <w:b w:val="0"/>
-        </w:rPr>
-        <w:t xml:space="preserve">判讀（詞庫改動需先過 </w:t>
-      </w:r>
-      <w:r>
-        <w:rPr>
-          <w:rFonts w:ascii="Consolas" w:hAnsi="Consolas" w:eastAsia="微軟正黑體"/>
-          <w:color w:val="B03A2E"/>
+          <w:i/>
+          <w:color w:val="888888"/>
           <w:sz w:val="19"/>
         </w:rPr>
-        <w:t>docs/情緒詞庫範本.docx</w:t>
-      </w:r>
-      <w:r>
-        <w:rPr>
-          <w:rFonts w:eastAsia="微軟正黑體"/>
-          <w:b w:val="0"/>
-        </w:rPr>
-        <w:t xml:space="preserve"> 審核流程），</w:t>
-      </w:r>
-    </w:p>
-    <w:p>
-      <w:r>
-        <w:rPr>
-          <w:rFonts w:eastAsia="微軟正黑體"/>
-          <w:b w:val="0"/>
-        </w:rPr>
-        <w:t>每日彙總成情緒分數供前台溫度條與 AI 引用。GPT 批次標註為下一階段（待金鑰，任務 #77）。</w:t>
+        <w:t>〔流程圖：請於 GitHub 線上版 README 檢視渲染後的圖表〕</w:t>
       </w:r>
     </w:p>
     <w:p>
@@ -3868,6 +3735,83 @@
           <w:rFonts w:eastAsia="微軟正黑體"/>
           <w:b w:val="0"/>
         </w:rPr>
+        <w:t>8. 新聞情緒管線</w:t>
+      </w:r>
+    </w:p>
+    <w:p>
+      <w:r>
+        <w:rPr>
+          <w:rFonts w:eastAsia="微軟正黑體"/>
+          <w:b w:val="0"/>
+        </w:rPr>
+        <w:t>真實來源（只搬運不創作，每則帶原始網址）：CoinTelegraph、CoinDesk、Decrypt、TheBlock、</w:t>
+      </w:r>
+    </w:p>
+    <w:p>
+      <w:r>
+        <w:rPr>
+          <w:rFonts w:eastAsia="微軟正黑體"/>
+          <w:b w:val="0"/>
+        </w:rPr>
+        <w:t>CryptoSlate、Blockworks、BitcoinMagazine、動區、鏈新聞 + Google News 中文聚合（市場級+幣種級）。</w:t>
+      </w:r>
+    </w:p>
+    <w:p>
+      <w:r>
+        <w:rPr>
+          <w:rFonts w:eastAsia="微軟正黑體"/>
+          <w:b w:val="0"/>
+        </w:rPr>
+        <w:t>標題經</w:t>
+      </w:r>
+      <w:r>
+        <w:rPr>
+          <w:rFonts w:eastAsia="微軟正黑體"/>
+          <w:b/>
+        </w:rPr>
+        <w:t>中英雙語加權詞庫</w:t>
+      </w:r>
+      <w:r>
+        <w:rPr>
+          <w:rFonts w:eastAsia="微軟正黑體"/>
+          <w:b w:val="0"/>
+        </w:rPr>
+        <w:t xml:space="preserve">判讀（詞庫改動需先過 </w:t>
+      </w:r>
+      <w:r>
+        <w:rPr>
+          <w:rFonts w:ascii="Consolas" w:hAnsi="Consolas" w:eastAsia="微軟正黑體"/>
+          <w:color w:val="B03A2E"/>
+          <w:sz w:val="19"/>
+        </w:rPr>
+        <w:t>docs/情緒詞庫範本.docx</w:t>
+      </w:r>
+      <w:r>
+        <w:rPr>
+          <w:rFonts w:eastAsia="微軟正黑體"/>
+          <w:b w:val="0"/>
+        </w:rPr>
+        <w:t xml:space="preserve"> 審核流程），</w:t>
+      </w:r>
+    </w:p>
+    <w:p>
+      <w:r>
+        <w:rPr>
+          <w:rFonts w:eastAsia="微軟正黑體"/>
+          <w:b w:val="0"/>
+        </w:rPr>
+        <w:t>每日彙總成情緒分數供前台溫度條與 AI 引用。GPT 批次標註為下一階段（待金鑰，任務 #77）。</w:t>
+      </w:r>
+    </w:p>
+    <w:p>
+      <w:pPr>
+        <w:pStyle w:val="Heading2"/>
+      </w:pPr>
+      <w:r>
+        <w:rPr>
+          <w:rFonts w:eastAsia="微軟正黑體"/>
+          <w:b w:val="0"/>
+        </w:rPr>
         <w:t>9. 訊號現況（誠實聲明）與路線圖</w:t>
       </w:r>
     </w:p>
@@ -4049,6 +3993,36 @@
           <w:b w:val="0"/>
         </w:rPr>
         <w:t>。</w:t>
+      </w:r>
+    </w:p>
+    <w:p>
+      <w:r>
+        <w:rPr>
+          <w:rFonts w:eastAsia="微軟正黑體"/>
+          <w:b/>
+        </w:rPr>
+        <w:t>▸ 圖：訊號研究軌跡（為何 6 因子降教學、動量策略上位）</w:t>
+      </w:r>
+      <w:r>
+        <w:rPr>
+          <w:rFonts w:eastAsia="微軟正黑體"/>
+          <w:b w:val="0"/>
+        </w:rPr>
+        <w:t>（線上 README 可見渲染圖）</w:t>
+      </w:r>
+    </w:p>
+    <w:p>
+      <w:pPr>
+        <w:ind w:left="170"/>
+      </w:pPr>
+      <w:r>
+        <w:rPr>
+          <w:rFonts w:eastAsia="微軟正黑體"/>
+          <w:i/>
+          <w:color w:val="888888"/>
+          <w:sz w:val="19"/>
+        </w:rPr>
+        <w:t>〔流程圖：請於 GitHub 線上版 README 檢視渲染後的圖表〕</w:t>
       </w:r>
     </w:p>
     <w:p>
@@ -4441,6 +4415,441 @@
           <w:sz w:val="18"/>
         </w:rPr>
         <w:t># 手動觸發排程等價動作：後台監控頁「重新匯入行情」或 python -c 呼叫 scheduler 函式</w:t>
+      </w:r>
+    </w:p>
+    <w:p>
+      <w:pPr>
+        <w:pStyle w:val="Heading2"/>
+      </w:pPr>
+      <w:r>
+        <w:rPr>
+          <w:rFonts w:eastAsia="微軟正黑體"/>
+          <w:b w:val="0"/>
+        </w:rPr>
+        <w:t>12. 未來規劃與可發展方向</w:t>
+      </w:r>
+    </w:p>
+    <w:p>
+      <w:pPr>
+        <w:ind w:left="340"/>
+      </w:pPr>
+      <w:r>
+        <w:rPr>
+          <w:color w:val="888888"/>
+        </w:rPr>
+        <w:t xml:space="preserve">▍ </w:t>
+      </w:r>
+      <w:r>
+        <w:rPr>
+          <w:rFonts w:eastAsia="微軟正黑體"/>
+          <w:b w:val="0"/>
+        </w:rPr>
+        <w:t>進度真相在後台「工作項目」（</w:t>
+      </w:r>
+      <w:r>
+        <w:rPr>
+          <w:rFonts w:ascii="Consolas" w:hAnsi="Consolas" w:eastAsia="微軟正黑體"/>
+          <w:color w:val="B03A2E"/>
+          <w:sz w:val="19"/>
+        </w:rPr>
+        <w:t>tasks</w:t>
+      </w:r>
+      <w:r>
+        <w:rPr>
+          <w:rFonts w:eastAsia="微軟正黑體"/>
+          <w:b w:val="0"/>
+        </w:rPr>
+        <w:t xml:space="preserve"> 表）；完整分層路線圖（T0 立即動手 → T4 未來參考）見 [</w:t>
+      </w:r>
+      <w:r>
+        <w:rPr>
+          <w:rFonts w:ascii="Consolas" w:hAnsi="Consolas" w:eastAsia="微軟正黑體"/>
+          <w:color w:val="B03A2E"/>
+          <w:sz w:val="19"/>
+        </w:rPr>
+        <w:t>docs/archive/專案路線圖.md</w:t>
+      </w:r>
+      <w:r>
+        <w:rPr>
+          <w:rFonts w:eastAsia="微軟正黑體"/>
+          <w:b w:val="0"/>
+        </w:rPr>
+        <w:t>](docs/archive/專案路線圖.md)。下列為六大發展方向的鳥瞰。</w:t>
+      </w:r>
+    </w:p>
+    <w:p>
+      <w:r>
+        <w:rPr>
+          <w:rFonts w:eastAsia="微軟正黑體"/>
+          <w:b/>
+        </w:rPr>
+        <w:t>▸ 圖：六大發展方向</w:t>
+      </w:r>
+      <w:r>
+        <w:rPr>
+          <w:rFonts w:eastAsia="微軟正黑體"/>
+          <w:b w:val="0"/>
+        </w:rPr>
+        <w:t>（線上 README 可見渲染圖）</w:t>
+      </w:r>
+    </w:p>
+    <w:p>
+      <w:pPr>
+        <w:ind w:left="170"/>
+      </w:pPr>
+      <w:r>
+        <w:rPr>
+          <w:rFonts w:eastAsia="微軟正黑體"/>
+          <w:i/>
+          <w:color w:val="888888"/>
+          <w:sz w:val="19"/>
+        </w:rPr>
+        <w:t>〔流程圖：請於 GitHub 線上版 README 檢視渲染後的圖表〕</w:t>
+      </w:r>
+    </w:p>
+    <w:p>
+      <w:r>
+        <w:rPr>
+          <w:rFonts w:eastAsia="微軟正黑體"/>
+          <w:b/>
+        </w:rPr>
+        <w:t>A. 訊號準度（核心價值、最該先做）</w:t>
+      </w:r>
+    </w:p>
+    <w:p>
+      <w:pPr>
+        <w:pStyle w:val="ListBullet"/>
+      </w:pPr>
+      <w:r>
+        <w:rPr>
+          <w:rFonts w:eastAsia="微軟正黑體"/>
+          <w:b/>
+        </w:rPr>
+        <w:t>訊號增準計畫（規則式）</w:t>
+      </w:r>
+      <w:r>
+        <w:rPr>
+          <w:rFonts w:eastAsia="微軟正黑體"/>
+          <w:b w:val="0"/>
+        </w:rPr>
+        <w:t xml:space="preserve">：Phase A 先把已驗證的防禦型動量策略搬上前台當正式建議、6 因子降級為教學分數；Phase B–D 做因子手術、regime 開關、walk-forward 校準。驗收門檻寫死：樣本外 5 日勝率 ≥ 基準 +0.5pp（見 </w:t>
+      </w:r>
+      <w:r>
+        <w:rPr>
+          <w:rFonts w:ascii="Consolas" w:hAnsi="Consolas" w:eastAsia="微軟正黑體"/>
+          <w:color w:val="B03A2E"/>
+          <w:sz w:val="19"/>
+        </w:rPr>
+        <w:t>docs/archive/訊號增準計畫.md</w:t>
+      </w:r>
+      <w:r>
+        <w:rPr>
+          <w:rFonts w:eastAsia="微軟正黑體"/>
+          <w:b w:val="0"/>
+        </w:rPr>
+        <w:t>）。</w:t>
+      </w:r>
+    </w:p>
+    <w:p>
+      <w:pPr>
+        <w:pStyle w:val="ListBullet"/>
+      </w:pPr>
+      <w:r>
+        <w:rPr>
+          <w:rFonts w:eastAsia="微軟正黑體"/>
+          <w:b/>
+        </w:rPr>
+        <w:t>ML 訊號研究</w:t>
+      </w:r>
+      <w:r>
+        <w:rPr>
+          <w:rFonts w:eastAsia="微軟正黑體"/>
+          <w:b w:val="0"/>
+        </w:rPr>
+        <w:t xml:space="preserve">：LightGBM + purged walk-forward，通過六道 Go/No-Go 關卡後成為「第三個 AI 引擎」（規則/GPT/ML 三票制）。需規則式先完成當地基（見 </w:t>
+      </w:r>
+      <w:r>
+        <w:rPr>
+          <w:rFonts w:ascii="Consolas" w:hAnsi="Consolas" w:eastAsia="微軟正黑體"/>
+          <w:color w:val="B03A2E"/>
+          <w:sz w:val="19"/>
+        </w:rPr>
+        <w:t>docs/archive/ML訊號研究計畫.md</w:t>
+      </w:r>
+      <w:r>
+        <w:rPr>
+          <w:rFonts w:eastAsia="微軟正黑體"/>
+          <w:b w:val="0"/>
+        </w:rPr>
+        <w:t>）。</w:t>
+      </w:r>
+    </w:p>
+    <w:p>
+      <w:r>
+        <w:rPr>
+          <w:rFonts w:eastAsia="微軟正黑體"/>
+          <w:b/>
+        </w:rPr>
+        <w:t>B. 產品閉環（從被動查詢 → 主動推播）</w:t>
+      </w:r>
+    </w:p>
+    <w:p>
+      <w:pPr>
+        <w:pStyle w:val="ListBullet"/>
+      </w:pPr>
+      <w:r>
+        <w:rPr>
+          <w:rFonts w:eastAsia="微軟正黑體"/>
+          <w:b w:val="0"/>
+        </w:rPr>
+        <w:t>到價 / 訊號變化通知（站內鈴鐺 + Telegram Bot，時線資料已就緒）。</w:t>
+      </w:r>
+    </w:p>
+    <w:p>
+      <w:pPr>
+        <w:pStyle w:val="ListBullet"/>
+      </w:pPr>
+      <w:r>
+        <w:rPr>
+          <w:rFonts w:eastAsia="微軟正黑體"/>
+          <w:b w:val="0"/>
+        </w:rPr>
+        <w:t>AI 每日晨報（每日 pipeline 後自動生成「今日市場 3 分鐘」，與通知串成閉環）。</w:t>
+      </w:r>
+    </w:p>
+    <w:p>
+      <w:pPr>
+        <w:pStyle w:val="ListBullet"/>
+      </w:pPr>
+      <w:r>
+        <w:rPr>
+          <w:rFonts w:eastAsia="微軟正黑體"/>
+          <w:b w:val="0"/>
+        </w:rPr>
+        <w:t>投資組合追蹤 + AI 健檢（手動輸入持倉 → 損益/配置；AI 用相關性矩陣做組合風險健檢）。</w:t>
+      </w:r>
+    </w:p>
+    <w:p>
+      <w:r>
+        <w:rPr>
+          <w:rFonts w:eastAsia="微軟正黑體"/>
+          <w:b/>
+        </w:rPr>
+        <w:t>C. 基礎設施與營運</w:t>
+      </w:r>
+    </w:p>
+    <w:p>
+      <w:pPr>
+        <w:pStyle w:val="ListBullet"/>
+      </w:pPr>
+      <w:r>
+        <w:rPr>
+          <w:rFonts w:eastAsia="微軟正黑體"/>
+          <w:b w:val="0"/>
+        </w:rPr>
+        <w:t>named tunnel 固定對外網址（根治「tunnel 重啟就換網址」）+ 服務化收尾。</w:t>
+      </w:r>
+    </w:p>
+    <w:p>
+      <w:pPr>
+        <w:pStyle w:val="ListBullet"/>
+      </w:pPr>
+      <w:r>
+        <w:rPr>
+          <w:rFonts w:eastAsia="微軟正黑體"/>
+          <w:b w:val="0"/>
+        </w:rPr>
+        <w:t xml:space="preserve">安全強化：登入失敗鎖定、per-IP 限流、寫入端點驗證、夜間 DB 備份、Cloudflare Access 保護 </w:t>
+      </w:r>
+      <w:r>
+        <w:rPr>
+          <w:rFonts w:ascii="Consolas" w:hAnsi="Consolas" w:eastAsia="微軟正黑體"/>
+          <w:color w:val="B03A2E"/>
+          <w:sz w:val="19"/>
+        </w:rPr>
+        <w:t>/admin</w:t>
+      </w:r>
+      <w:r>
+        <w:rPr>
+          <w:rFonts w:eastAsia="微軟正黑體"/>
+          <w:b w:val="0"/>
+        </w:rPr>
+        <w:t>。</w:t>
+      </w:r>
+    </w:p>
+    <w:p>
+      <w:pPr>
+        <w:pStyle w:val="ListBullet"/>
+      </w:pPr>
+      <w:r>
+        <w:rPr>
+          <w:rFonts w:eastAsia="微軟正黑體"/>
+          <w:b w:val="0"/>
+        </w:rPr>
+        <w:t xml:space="preserve">使用分析：加 </w:t>
+      </w:r>
+      <w:r>
+        <w:rPr>
+          <w:rFonts w:ascii="Consolas" w:hAnsi="Consolas" w:eastAsia="微軟正黑體"/>
+          <w:color w:val="B03A2E"/>
+          <w:sz w:val="19"/>
+        </w:rPr>
+        <w:t>access_log</w:t>
+      </w:r>
+      <w:r>
+        <w:rPr>
+          <w:rFonts w:eastAsia="微軟正黑體"/>
+          <w:b w:val="0"/>
+        </w:rPr>
+        <w:t xml:space="preserve"> middleware → 造訪量 / 熱門幣 / API 狀況。</w:t>
+      </w:r>
+    </w:p>
+    <w:p>
+      <w:r>
+        <w:rPr>
+          <w:rFonts w:eastAsia="微軟正黑體"/>
+          <w:b/>
+        </w:rPr>
+        <w:t>D. AI / 內容深化</w:t>
+      </w:r>
+    </w:p>
+    <w:p>
+      <w:pPr>
+        <w:pStyle w:val="ListBullet"/>
+      </w:pPr>
+      <w:r>
+        <w:rPr>
+          <w:rFonts w:eastAsia="微軟正黑體"/>
+          <w:b w:val="0"/>
+        </w:rPr>
+        <w:t>GPT 新聞批次情緒標註（治詞庫版 neutral 佔比偏高，成本 &lt;$0.01/天）。</w:t>
+      </w:r>
+    </w:p>
+    <w:p>
+      <w:pPr>
+        <w:pStyle w:val="ListBullet"/>
+      </w:pPr>
+      <w:r>
+        <w:rPr>
+          <w:rFonts w:eastAsia="微軟正黑體"/>
+          <w:b w:val="0"/>
+        </w:rPr>
+        <w:t>詞庫 / 問答庫後台管理化（主管核可流程確立後，線上即改即生效）。</w:t>
+      </w:r>
+    </w:p>
+    <w:p>
+      <w:pPr>
+        <w:pStyle w:val="ListBullet"/>
+      </w:pPr>
+      <w:r>
+        <w:rPr>
+          <w:rFonts w:eastAsia="微軟正黑體"/>
+          <w:b w:val="0"/>
+        </w:rPr>
+        <w:t>小Q 回答評分 👍👎（微調資料集地基）、情境動畫擴充。</w:t>
+      </w:r>
+    </w:p>
+    <w:p>
+      <w:r>
+        <w:rPr>
+          <w:rFonts w:eastAsia="微軟正黑體"/>
+          <w:b/>
+        </w:rPr>
+        <w:t>E. 前台體驗</w:t>
+      </w:r>
+    </w:p>
+    <w:p>
+      <w:pPr>
+        <w:pStyle w:val="ListBullet"/>
+      </w:pPr>
+      <w:r>
+        <w:rPr>
+          <w:rFonts w:eastAsia="微軟正黑體"/>
+          <w:b w:val="0"/>
+        </w:rPr>
+        <w:t>簡易 / 專業模式切換 + 三大畫面白話版（紅綠燈、preset、進階摺疊）。</w:t>
+      </w:r>
+    </w:p>
+    <w:p>
+      <w:pPr>
+        <w:pStyle w:val="ListBullet"/>
+      </w:pPr>
+      <w:r>
+        <w:rPr>
+          <w:rFonts w:eastAsia="微軟正黑體"/>
+          <w:b w:val="0"/>
+        </w:rPr>
+        <w:t>新手導覽 + 名詞辭典、API 失敗錯誤橫幅、載入骨架。</w:t>
+      </w:r>
+    </w:p>
+    <w:p>
+      <w:pPr>
+        <w:pStyle w:val="ListBullet"/>
+      </w:pPr>
+      <w:r>
+        <w:rPr>
+          <w:rFonts w:eastAsia="微軟正黑體"/>
+          <w:b w:val="0"/>
+        </w:rPr>
+        <w:t>圖表指標與時線擴充（4h / 更多幣，架構已參數化）。</w:t>
+      </w:r>
+    </w:p>
+    <w:p>
+      <w:r>
+        <w:rPr>
+          <w:rFonts w:eastAsia="微軟正黑體"/>
+          <w:b/>
+        </w:rPr>
+        <w:t>F. 宏觀面板重新定位</w:t>
+      </w:r>
+    </w:p>
+    <w:p>
+      <w:pPr>
+        <w:pStyle w:val="ListBullet"/>
+      </w:pPr>
+      <w:r>
+        <w:rPr>
+          <w:rFonts w:ascii="Consolas" w:hAnsi="Consolas" w:eastAsia="微軟正黑體"/>
+          <w:color w:val="B03A2E"/>
+          <w:sz w:val="19"/>
+        </w:rPr>
+        <w:t>MacroPanel</w:t>
+      </w:r>
+      <w:r>
+        <w:rPr>
+          <w:rFonts w:eastAsia="微軟正黑體"/>
+          <w:b w:val="0"/>
+        </w:rPr>
+        <w:t xml:space="preserve"> 現隱藏保留；未來或改為「</w:t>
+      </w:r>
+      <w:r>
+        <w:rPr>
+          <w:rFonts w:eastAsia="微軟正黑體"/>
+          <w:b/>
+        </w:rPr>
+        <w:t>以 BTC 為主的相關性溫度計</w:t>
+      </w:r>
+      <w:r>
+        <w:rPr>
+          <w:rFonts w:eastAsia="微軟正黑體"/>
+          <w:b w:val="0"/>
+        </w:rPr>
+        <w:t xml:space="preserve">」版本再上架（價值待議，程式與 </w:t>
+      </w:r>
+      <w:r>
+        <w:rPr>
+          <w:rFonts w:ascii="Consolas" w:hAnsi="Consolas" w:eastAsia="微軟正黑體"/>
+          <w:color w:val="B03A2E"/>
+          <w:sz w:val="19"/>
+        </w:rPr>
+        <w:t>/api/macro</w:t>
+      </w:r>
+      <w:r>
+        <w:rPr>
+          <w:rFonts w:eastAsia="微軟正黑體"/>
+          <w:b w:val="0"/>
+        </w:rPr>
+        <w:t xml:space="preserve"> 已備）。</w:t>
       </w:r>
     </w:p>
     <w:sectPr>

</xml_diff>